<commit_message>
IV Calculo de magnitudes y eventos
- Calculo de V e I RMS
- Calculo de Frecuencia por cruce de 0.
- Calculo de P,Q,S y FP.
- Calculo de eventos SAG y SWELL con maquina de estados.
</commit_message>
<xml_diff>
--- a/firmware/doc/IV. Analisis Electrico.docx
+++ b/firmware/doc/IV. Analisis Electrico.docx
@@ -61,7 +61,6 @@
           <w:szCs w:val="20"/>
         </w:rPr>
       </w:pPr>
-      <w:proofErr w:type="spellStart"/>
       <w:r>
         <w:rPr>
           <w:b/>
@@ -69,7 +68,6 @@
         </w:rPr>
         <w:t>Commit</w:t>
       </w:r>
-      <w:proofErr w:type="spellEnd"/>
       <w:r>
         <w:t>:</w:t>
       </w:r>
@@ -95,58 +93,226 @@
           <w:u w:val="none"/>
         </w:rPr>
       </w:pPr>
-      <w:proofErr w:type="spellStart"/>
       <w:r>
         <w:rPr>
           <w:rStyle w:val="Hipervnculo"/>
           <w:color w:val="0F4761" w:themeColor="accent1" w:themeShade="BF"/>
           <w:u w:val="none"/>
         </w:rPr>
-        <w:t>Calculo</w:t>
-      </w:r>
-      <w:proofErr w:type="spellEnd"/>
+        <w:t>Calculo de magnitudes</w:t>
+      </w:r>
       <w:r>
         <w:rPr>
           <w:rStyle w:val="Hipervnculo"/>
           <w:color w:val="0F4761" w:themeColor="accent1" w:themeShade="BF"/>
           <w:u w:val="none"/>
         </w:rPr>
-        <w:t xml:space="preserve"> de magnitudes</w:t>
-      </w:r>
-      <w:r>
-        <w:rPr>
-          <w:rStyle w:val="Hipervnculo"/>
-          <w:color w:val="0F4761" w:themeColor="accent1" w:themeShade="BF"/>
-          <w:u w:val="none"/>
-        </w:rPr>
         <w:t>:</w:t>
       </w:r>
     </w:p>
     <w:p>
       <w:r>
-        <w:t xml:space="preserve">Foto de resultado de </w:t>
-      </w:r>
-      <w:proofErr w:type="spellStart"/>
-      <w:r>
-        <w:t>calculo</w:t>
-      </w:r>
-      <w:proofErr w:type="spellEnd"/>
-      <w:r>
-        <w:t xml:space="preserve"> de valores RMS</w:t>
-      </w:r>
-    </w:p>
-    <w:p/>
+        <w:rPr>
+          <w:noProof/>
+        </w:rPr>
+        <w:drawing>
+          <wp:inline distT="0" distB="0" distL="0" distR="0" wp14:anchorId="7911E862" wp14:editId="1DDC3D9B">
+            <wp:extent cx="5400040" cy="4050030"/>
+            <wp:effectExtent l="0" t="0" r="0" b="7620"/>
+            <wp:docPr id="2" name="Imagen 2"/>
+            <wp:cNvGraphicFramePr>
+              <a:graphicFrameLocks xmlns:a="http://schemas.openxmlformats.org/drawingml/2006/main" noChangeAspect="1"/>
+            </wp:cNvGraphicFramePr>
+            <a:graphic xmlns:a="http://schemas.openxmlformats.org/drawingml/2006/main">
+              <a:graphicData uri="http://schemas.openxmlformats.org/drawingml/2006/picture">
+                <pic:pic xmlns:pic="http://schemas.openxmlformats.org/drawingml/2006/picture">
+                  <pic:nvPicPr>
+                    <pic:cNvPr id="0" name="Picture 3"/>
+                    <pic:cNvPicPr>
+                      <a:picLocks noChangeAspect="1" noChangeArrowheads="1"/>
+                    </pic:cNvPicPr>
+                  </pic:nvPicPr>
+                  <pic:blipFill>
+                    <a:blip r:embed="rId5" cstate="print">
+                      <a:extLst>
+                        <a:ext uri="{28A0092B-C50C-407E-A947-70E740481C1C}">
+                          <a14:useLocalDpi xmlns:a14="http://schemas.microsoft.com/office/drawing/2010/main" val="0"/>
+                        </a:ext>
+                      </a:extLst>
+                    </a:blip>
+                    <a:srcRect/>
+                    <a:stretch>
+                      <a:fillRect/>
+                    </a:stretch>
+                  </pic:blipFill>
+                  <pic:spPr bwMode="auto">
+                    <a:xfrm>
+                      <a:off x="0" y="0"/>
+                      <a:ext cx="5400040" cy="4050030"/>
+                    </a:xfrm>
+                    <a:prstGeom prst="rect">
+                      <a:avLst/>
+                    </a:prstGeom>
+                    <a:noFill/>
+                    <a:ln>
+                      <a:noFill/>
+                    </a:ln>
+                  </pic:spPr>
+                </pic:pic>
+              </a:graphicData>
+            </a:graphic>
+          </wp:inline>
+        </w:drawing>
+      </w:r>
+    </w:p>
+    <w:p>
+      <w:r>
+        <w:t>Se observa:</w:t>
+      </w:r>
+    </w:p>
+    <w:p>
+      <m:oMathPara>
+        <m:oMath>
+          <m:r>
+            <w:rPr>
+              <w:rFonts w:ascii="Cambria Math" w:hAnsi="Cambria Math"/>
+            </w:rPr>
+            <m:t>Voltimetro:233V                Medidor:  232,63 V</m:t>
+          </m:r>
+        </m:oMath>
+      </m:oMathPara>
+    </w:p>
+    <w:p>
+      <w:pPr>
+        <w:rPr>
+          <w:rFonts w:ascii="Consolas" w:hAnsi="Consolas"/>
+          <w:b/>
+          <w:bCs/>
+          <w:sz w:val="20"/>
+          <w:szCs w:val="20"/>
+          <w:u w:val="single"/>
+          <w:shd w:val="clear" w:color="auto" w:fill="FFFFFF"/>
+        </w:rPr>
+      </w:pPr>
+      <w:r>
+        <w:t xml:space="preserve">Funciones: </w:t>
+      </w:r>
+      <w:r>
+        <w:rPr>
+          <w:rFonts w:ascii="Consolas" w:hAnsi="Consolas"/>
+          <w:b/>
+          <w:bCs/>
+          <w:color w:val="000000"/>
+          <w:sz w:val="20"/>
+          <w:szCs w:val="20"/>
+          <w:shd w:val="clear" w:color="auto" w:fill="FFFFFF"/>
+        </w:rPr>
+        <w:t xml:space="preserve">CalculateMean y </w:t>
+      </w:r>
+      <w:r>
+        <w:rPr>
+          <w:rFonts w:ascii="Consolas" w:hAnsi="Consolas"/>
+          <w:b/>
+          <w:bCs/>
+          <w:sz w:val="20"/>
+          <w:szCs w:val="20"/>
+          <w:u w:val="single"/>
+          <w:shd w:val="clear" w:color="auto" w:fill="FFFFFF"/>
+        </w:rPr>
+        <w:t>CalculateRMS</w:t>
+      </w:r>
+    </w:p>
+    <w:p>
+      <w:pPr>
+        <w:rPr>
+          <w:rFonts w:ascii="Consolas" w:hAnsi="Consolas"/>
+          <w:sz w:val="20"/>
+          <w:szCs w:val="20"/>
+          <w:shd w:val="clear" w:color="auto" w:fill="FFFFFF"/>
+        </w:rPr>
+      </w:pPr>
+      <w:r>
+        <w:rPr>
+          <w:rFonts w:ascii="Consolas" w:hAnsi="Consolas"/>
+          <w:b/>
+          <w:bCs/>
+          <w:sz w:val="20"/>
+          <w:szCs w:val="20"/>
+          <w:u w:val="single"/>
+          <w:shd w:val="clear" w:color="auto" w:fill="FFFFFF"/>
+        </w:rPr>
+        <w:t>Medición de frecuencia de línea</w:t>
+      </w:r>
+      <w:r>
+        <w:rPr>
+          <w:rFonts w:ascii="Consolas" w:hAnsi="Consolas"/>
+          <w:b/>
+          <w:bCs/>
+          <w:sz w:val="20"/>
+          <w:szCs w:val="20"/>
+          <w:u w:val="single"/>
+          <w:shd w:val="clear" w:color="auto" w:fill="FFFFFF"/>
+        </w:rPr>
+        <w:t xml:space="preserve">: </w:t>
+      </w:r>
+      <w:r>
+        <w:rPr>
+          <w:rFonts w:ascii="Consolas" w:hAnsi="Consolas"/>
+          <w:sz w:val="20"/>
+          <w:szCs w:val="20"/>
+          <w:shd w:val="clear" w:color="auto" w:fill="FFFFFF"/>
+        </w:rPr>
+        <w:t>Utilizamos algoritmo de medición de cruce por cero.</w:t>
+      </w:r>
+    </w:p>
+    <w:p>
+      <w:r>
+        <w:rPr>
+          <w:noProof/>
+        </w:rPr>
+        <w:drawing>
+          <wp:inline distT="0" distB="0" distL="0" distR="0" wp14:anchorId="55C6E285" wp14:editId="49ECD950">
+            <wp:extent cx="4400776" cy="730288"/>
+            <wp:effectExtent l="0" t="0" r="0" b="0"/>
+            <wp:docPr id="1" name="Imagen 1"/>
+            <wp:cNvGraphicFramePr>
+              <a:graphicFrameLocks xmlns:a="http://schemas.openxmlformats.org/drawingml/2006/main" noChangeAspect="1"/>
+            </wp:cNvGraphicFramePr>
+            <a:graphic xmlns:a="http://schemas.openxmlformats.org/drawingml/2006/main">
+              <a:graphicData uri="http://schemas.openxmlformats.org/drawingml/2006/picture">
+                <pic:pic xmlns:pic="http://schemas.openxmlformats.org/drawingml/2006/picture">
+                  <pic:nvPicPr>
+                    <pic:cNvPr id="1" name=""/>
+                    <pic:cNvPicPr/>
+                  </pic:nvPicPr>
+                  <pic:blipFill>
+                    <a:blip r:embed="rId6"/>
+                    <a:stretch>
+                      <a:fillRect/>
+                    </a:stretch>
+                  </pic:blipFill>
+                  <pic:spPr>
+                    <a:xfrm>
+                      <a:off x="0" y="0"/>
+                      <a:ext cx="4400776" cy="730288"/>
+                    </a:xfrm>
+                    <a:prstGeom prst="rect">
+                      <a:avLst/>
+                    </a:prstGeom>
+                  </pic:spPr>
+                </pic:pic>
+              </a:graphicData>
+            </a:graphic>
+          </wp:inline>
+        </w:drawing>
+      </w:r>
+    </w:p>
     <w:p>
       <w:pPr>
         <w:pStyle w:val="Ttulo1"/>
       </w:pPr>
-      <w:proofErr w:type="spellStart"/>
-      <w:r>
-        <w:t>Armonicos</w:t>
-      </w:r>
-      <w:proofErr w:type="spellEnd"/>
-      <w:r>
-        <w:t xml:space="preserve"> y Eventos</w:t>
+      <w:r>
+        <w:t>Armonicos y Eventos</w:t>
       </w:r>
     </w:p>
     <w:p>
@@ -178,42 +344,25 @@
         <w:t>lleguen hasta el n°</w:t>
       </w:r>
       <w:r>
-        <w:t>40, no en la totalidad del espectro de frecuencias. Con los parámetros de diseño adoptados hasta ahora podríamos medir hasta el armónico 50, que está muy cerca del limite más adelante veremos si es necesario aumentar un poco más la frecuencia de muestreo u algún otro parámetro.</w:t>
-      </w:r>
-    </w:p>
-    <w:p>
-      <w:r>
-        <w:t xml:space="preserve">Por los motivos anteriores, en lugar de usar </w:t>
-      </w:r>
-      <w:proofErr w:type="spellStart"/>
-      <w:r>
-        <w:t>fft</w:t>
-      </w:r>
-      <w:proofErr w:type="spellEnd"/>
-      <w:r>
-        <w:t>, decidimos implementar una lógica de cálculo utilizando un a</w:t>
-      </w:r>
-      <w:r>
-        <w:t xml:space="preserve">lgoritmo de </w:t>
-      </w:r>
-      <w:proofErr w:type="spellStart"/>
-      <w:r>
-        <w:t>Goertzel</w:t>
-      </w:r>
-      <w:proofErr w:type="spellEnd"/>
+        <w:t xml:space="preserve">40, no en la totalidad del </w:t>
+      </w:r>
+      <w:r>
+        <w:lastRenderedPageBreak/>
+        <w:t>espectro de frecuencias. Con los parámetros de diseño adoptados hasta ahora podríamos medir hasta el armónico 50, que está muy cerca del limite más adelante veremos si es necesario aumentar un poco más la frecuencia de muestreo u algún otro parámetro.</w:t>
+      </w:r>
+    </w:p>
+    <w:p>
+      <w:r>
+        <w:t>Por los motivos anteriores, en lugar de usar fft, decidimos implementar una lógica de cálculo utilizando un a</w:t>
+      </w:r>
+      <w:r>
+        <w:t>lgoritmo de Goertzel</w:t>
+      </w:r>
       <w:r>
         <w:t>. Este nos permite calcular solo las componentes espectrales que nos interesan reduciendo el costo computacional notablemente y cumpliendo con la consigna.</w:t>
       </w:r>
       <w:r>
-        <w:t xml:space="preserve"> Como contraposición no podremos implementar una detección automática de </w:t>
-      </w:r>
-      <w:proofErr w:type="spellStart"/>
-      <w:r>
-        <w:t>interarmonicos</w:t>
-      </w:r>
-      <w:proofErr w:type="spellEnd"/>
-      <w:r>
-        <w:t>, al menos en esta versión, pero dicha prestación no fue proyectada durante la etapa de inicio.</w:t>
+        <w:t xml:space="preserve"> Como contraposición no podremos implementar una detección automática de interarmonicos, al menos en esta versión, pero dicha prestación no fue proyectada durante la etapa de inicio.</w:t>
       </w:r>
     </w:p>
     <w:p>
@@ -230,24 +379,14 @@
           <w:bCs/>
           <w:u w:val="single"/>
         </w:rPr>
-        <w:t xml:space="preserve">Algoritmo de </w:t>
-      </w:r>
-      <w:proofErr w:type="spellStart"/>
+        <w:t>Algoritmo de Goertzel</w:t>
+      </w:r>
+    </w:p>
+    <w:p>
       <w:r>
         <w:rPr>
           <w:b/>
           <w:bCs/>
-          <w:u w:val="single"/>
-        </w:rPr>
-        <w:t>Goertzel</w:t>
-      </w:r>
-      <w:proofErr w:type="spellEnd"/>
-    </w:p>
-    <w:p>
-      <w:r>
-        <w:rPr>
-          <w:b/>
-          <w:bCs/>
         </w:rPr>
         <w:t>Objetivo</w:t>
       </w:r>
@@ -255,10 +394,7 @@
         <w:t>:</w:t>
       </w:r>
       <w:r>
-        <w:t xml:space="preserve"> </w:t>
-      </w:r>
-      <w:r>
-        <w:t>conocer la amplitud de una componente de frecuencia espec</w:t>
+        <w:t xml:space="preserve"> conocer la amplitud de una componente de frecuencia espec</w:t>
       </w:r>
       <w:r>
         <w:rPr>
@@ -294,24 +430,7 @@
         <w:t>ñ</w:t>
       </w:r>
       <w:r>
-        <w:t>al x[n] de N muestras calcula, para cada frecuencia (</w:t>
-      </w:r>
-      <w:proofErr w:type="spellStart"/>
-      <w:r>
-        <w:t>bin</w:t>
-      </w:r>
-      <w:proofErr w:type="spellEnd"/>
-      <w:r>
-        <w:t>)</w:t>
-      </w:r>
-      <w:r>
-        <w:t xml:space="preserve"> </w:t>
-      </w:r>
-      <w:r>
-        <w:t>k</w:t>
-      </w:r>
-      <w:r>
-        <w:t>.</w:t>
+        <w:t>al x[n] de N muestras calcula, para cada frecuencia (bin) k.</w:t>
       </w:r>
     </w:p>
     <w:p>
@@ -464,16 +583,7 @@
                     <w:rPr>
                       <w:rFonts w:ascii="Cambria Math" w:hAnsi="Cambria Math"/>
                     </w:rPr>
-                    <m:t xml:space="preserve"> </m:t>
-                  </m:r>
-                  <m:r>
-                    <m:rPr>
-                      <m:sty m:val="p"/>
-                    </m:rPr>
-                    <w:rPr>
-                      <w:rFonts w:ascii="Cambria Math" w:hAnsi="Cambria Math"/>
-                    </w:rPr>
-                    <m:t>​kn</m:t>
+                    <m:t xml:space="preserve"> ​kn</m:t>
                   </m:r>
                 </m:sup>
               </m:sSup>
@@ -554,6 +664,9 @@
             <m:t xml:space="preserve">   </m:t>
           </m:r>
           <m:r>
+            <m:rPr>
+              <m:sty m:val="p"/>
+            </m:rPr>
             <w:rPr>
               <w:rFonts w:eastAsiaTheme="minorEastAsia"/>
             </w:rPr>
@@ -644,7 +757,6 @@
           <w:rFonts w:eastAsiaTheme="minorEastAsia"/>
           <w:lang w:val="es-ES"/>
         </w:rPr>
-        <w:lastRenderedPageBreak/>
         <w:t xml:space="preserve">Fuera del orden que debe cumplir </w:t>
       </w:r>
       <w:r>
@@ -694,23 +806,7 @@
           <w:rFonts w:eastAsiaTheme="minorEastAsia"/>
           <w:lang w:val="es-ES"/>
         </w:rPr>
-        <w:t xml:space="preserve">es </w:t>
-      </w:r>
-      <w:proofErr w:type="gramStart"/>
-      <w:r>
-        <w:rPr>
-          <w:rFonts w:eastAsiaTheme="minorEastAsia"/>
-          <w:lang w:val="es-ES"/>
-        </w:rPr>
-        <w:t>oportuno</w:t>
-      </w:r>
-      <w:proofErr w:type="gramEnd"/>
-      <w:r>
-        <w:rPr>
-          <w:rFonts w:eastAsiaTheme="minorEastAsia"/>
-          <w:lang w:val="es-ES"/>
-        </w:rPr>
-        <w:t xml:space="preserve"> pero no </w:t>
+        <w:t xml:space="preserve">es oportuno pero no </w:t>
       </w:r>
       <w:r>
         <w:rPr>
@@ -895,35 +991,7 @@
               <w:rFonts w:ascii="Cambria Math" w:eastAsiaTheme="minorEastAsia" w:hAnsi="Cambria Math"/>
               <w:lang w:val="es-ES"/>
             </w:rPr>
-            <m:t>k=</m:t>
-          </m:r>
-          <m:r>
-            <w:rPr>
-              <w:rFonts w:ascii="Cambria Math" w:eastAsiaTheme="minorEastAsia" w:hAnsi="Cambria Math"/>
-              <w:lang w:val="es-ES"/>
-            </w:rPr>
-            <m:t>2</m:t>
-          </m:r>
-          <m:r>
-            <w:rPr>
-              <w:rFonts w:ascii="Cambria Math" w:eastAsiaTheme="minorEastAsia" w:hAnsi="Cambria Math"/>
-              <w:lang w:val="es-ES"/>
-            </w:rPr>
-            <m:t xml:space="preserve">  =&gt;  </m:t>
-          </m:r>
-          <m:r>
-            <w:rPr>
-              <w:rFonts w:ascii="Cambria Math" w:eastAsiaTheme="minorEastAsia" w:hAnsi="Cambria Math"/>
-              <w:lang w:val="es-ES"/>
-            </w:rPr>
-            <m:t>10</m:t>
-          </m:r>
-          <m:r>
-            <w:rPr>
-              <w:rFonts w:ascii="Cambria Math" w:eastAsiaTheme="minorEastAsia" w:hAnsi="Cambria Math"/>
-              <w:lang w:val="es-ES"/>
-            </w:rPr>
-            <m:t>0Hz</m:t>
+            <m:t>k=2  =&gt;  100Hz</m:t>
           </m:r>
         </m:oMath>
       </m:oMathPara>
@@ -942,35 +1010,7 @@
               <w:rFonts w:ascii="Cambria Math" w:eastAsiaTheme="minorEastAsia" w:hAnsi="Cambria Math"/>
               <w:lang w:val="es-ES"/>
             </w:rPr>
-            <m:t>k=</m:t>
-          </m:r>
-          <m:r>
-            <w:rPr>
-              <w:rFonts w:ascii="Cambria Math" w:eastAsiaTheme="minorEastAsia" w:hAnsi="Cambria Math"/>
-              <w:lang w:val="es-ES"/>
-            </w:rPr>
-            <m:t>3</m:t>
-          </m:r>
-          <m:r>
-            <w:rPr>
-              <w:rFonts w:ascii="Cambria Math" w:eastAsiaTheme="minorEastAsia" w:hAnsi="Cambria Math"/>
-              <w:lang w:val="es-ES"/>
-            </w:rPr>
-            <m:t xml:space="preserve">  =&gt;  </m:t>
-          </m:r>
-          <m:r>
-            <w:rPr>
-              <w:rFonts w:ascii="Cambria Math" w:eastAsiaTheme="minorEastAsia" w:hAnsi="Cambria Math"/>
-              <w:lang w:val="es-ES"/>
-            </w:rPr>
-            <m:t>1</m:t>
-          </m:r>
-          <m:r>
-            <w:rPr>
-              <w:rFonts w:ascii="Cambria Math" w:eastAsiaTheme="minorEastAsia" w:hAnsi="Cambria Math"/>
-              <w:lang w:val="es-ES"/>
-            </w:rPr>
-            <m:t>50Hz</m:t>
+            <m:t>k=3  =&gt;  150Hz</m:t>
           </m:r>
         </m:oMath>
       </m:oMathPara>
@@ -1008,35 +1048,8 @@
               <w:rFonts w:ascii="Cambria Math" w:eastAsiaTheme="minorEastAsia" w:hAnsi="Cambria Math"/>
               <w:lang w:val="es-ES"/>
             </w:rPr>
-            <m:t>k=</m:t>
-          </m:r>
-          <m:r>
-            <w:rPr>
-              <w:rFonts w:ascii="Cambria Math" w:eastAsiaTheme="minorEastAsia" w:hAnsi="Cambria Math"/>
-              <w:lang w:val="es-ES"/>
-            </w:rPr>
-            <m:t>N</m:t>
-          </m:r>
-          <m:r>
-            <w:rPr>
-              <w:rFonts w:ascii="Cambria Math" w:eastAsiaTheme="minorEastAsia" w:hAnsi="Cambria Math"/>
-              <w:lang w:val="es-ES"/>
-            </w:rPr>
-            <m:t xml:space="preserve"> =&gt;  </m:t>
-          </m:r>
-          <m:r>
-            <w:rPr>
-              <w:rFonts w:ascii="Cambria Math" w:eastAsiaTheme="minorEastAsia" w:hAnsi="Cambria Math"/>
-              <w:lang w:val="es-ES"/>
-            </w:rPr>
-            <m:t>N*</m:t>
-          </m:r>
-          <m:r>
-            <w:rPr>
-              <w:rFonts w:ascii="Cambria Math" w:eastAsiaTheme="minorEastAsia" w:hAnsi="Cambria Math"/>
-              <w:lang w:val="es-ES"/>
-            </w:rPr>
-            <m:t>50Hz</m:t>
+            <w:lastRenderedPageBreak/>
+            <m:t>k=N =&gt;  N*50Hz</m:t>
           </m:r>
         </m:oMath>
       </m:oMathPara>
@@ -1071,13 +1084,8 @@
       <w:r>
         <w:t xml:space="preserve">. </w:t>
       </w:r>
-      <w:proofErr w:type="spellStart"/>
-      <w:r>
-        <w:t>Goertzel</w:t>
-      </w:r>
-      <w:proofErr w:type="spellEnd"/>
-      <w:r>
-        <w:t xml:space="preserve"> reformula el c</w:t>
+      <w:r>
+        <w:t>Goertzel reformula el c</w:t>
       </w:r>
       <w:r>
         <w:rPr>
@@ -1126,13 +1134,8 @@
       </w:r>
     </w:p>
     <w:p>
-      <w:proofErr w:type="spellStart"/>
-      <w:r>
-        <w:t>Goertzel</w:t>
-      </w:r>
-      <w:proofErr w:type="spellEnd"/>
-      <w:r>
-        <w:t xml:space="preserve"> define la relación de recurrencia:</w:t>
+      <w:r>
+        <w:t>Goertzel define la relación de recurrencia:</w:t>
       </w:r>
     </w:p>
     <w:p>
@@ -1315,10 +1318,7 @@
     </w:p>
     <w:p>
       <w:r>
-        <w:t>con condiciones iniciales</w:t>
-      </w:r>
-      <w:r>
-        <w:t>:</w:t>
+        <w:t>con condiciones iniciales:</w:t>
       </w:r>
     </w:p>
     <w:p>
@@ -1398,25 +1398,7 @@
             <w:rPr>
               <w:rFonts w:ascii="Cambria Math" w:hAnsi="Cambria Math"/>
             </w:rPr>
-            <m:t>=0</m:t>
-          </m:r>
-          <m:r>
-            <m:rPr>
-              <m:sty m:val="p"/>
-            </m:rPr>
-            <w:rPr>
-              <w:rFonts w:ascii="Cambria Math" w:hAnsi="Cambria Math"/>
-            </w:rPr>
-            <m:t xml:space="preserve">       iterando para </m:t>
-          </m:r>
-          <m:r>
-            <m:rPr>
-              <m:sty m:val="p"/>
-            </m:rPr>
-            <w:rPr>
-              <w:rFonts w:ascii="Cambria Math" w:hAnsi="Cambria Math"/>
-            </w:rPr>
-            <m:t xml:space="preserve">n=0,1,...,N-1. </m:t>
+            <m:t xml:space="preserve">=0       iterando para n=0,1,...,N-1. </m:t>
           </m:r>
         </m:oMath>
       </m:oMathPara>
@@ -1608,16 +1590,7 @@
             <w:rPr>
               <w:rFonts w:ascii="Cambria Math" w:hAnsi="Cambria Math"/>
             </w:rPr>
-            <m:t xml:space="preserve"> </m:t>
-          </m:r>
-          <m:r>
-            <m:rPr>
-              <m:sty m:val="p"/>
-            </m:rPr>
-            <w:rPr>
-              <w:rFonts w:ascii="Cambria Math" w:hAnsi="Cambria Math"/>
-            </w:rPr>
-            <m:t>cos(</m:t>
+            <m:t xml:space="preserve"> cos(</m:t>
           </m:r>
           <m:f>
             <m:fPr>
@@ -1753,16 +1726,7 @@
             <w:rPr>
               <w:rFonts w:ascii="Cambria Math" w:hAnsi="Cambria Math"/>
             </w:rPr>
-            <m:t xml:space="preserve"> </m:t>
-          </m:r>
-          <m:r>
-            <m:rPr>
-              <m:sty m:val="p"/>
-            </m:rPr>
-            <w:rPr>
-              <w:rFonts w:ascii="Cambria Math" w:hAnsi="Cambria Math"/>
-            </w:rPr>
-            <m:t>sin(</m:t>
+            <m:t xml:space="preserve"> sin(</m:t>
           </m:r>
           <m:f>
             <m:fPr>
@@ -1806,7 +1770,6 @@
     </w:p>
     <w:p>
       <w:r>
-        <w:lastRenderedPageBreak/>
         <w:t xml:space="preserve">Luego </w:t>
       </w:r>
       <w:r>
@@ -1951,33 +1914,7 @@
     </w:p>
     <w:p>
       <w:r>
-        <w:t xml:space="preserve">El factor de normalización 2/N </w:t>
-      </w:r>
-      <w:r>
-        <w:t xml:space="preserve">se debe a que </w:t>
-      </w:r>
-      <w:r>
-        <w:t xml:space="preserve">cuando </w:t>
-      </w:r>
-      <w:r>
-        <w:t>tomamos</w:t>
-      </w:r>
-      <w:r>
-        <w:t xml:space="preserve"> N muestras reales de una señal senoidal pura de amplitud pico A, la energía de esa componente se reparte simétricamente entre el </w:t>
-      </w:r>
-      <w:proofErr w:type="spellStart"/>
-      <w:r>
-        <w:t>bin</w:t>
-      </w:r>
-      <w:proofErr w:type="spellEnd"/>
-      <w:r>
-        <w:t xml:space="preserve"> k y su "espejo conjugado" en N−k (una propiedad de la DFT de señales reales)</w:t>
-      </w:r>
-      <w:r>
-        <w:t xml:space="preserve">. De esta forma </w:t>
-      </w:r>
-      <w:r>
-        <w:t>Multiplicar por 2/N compensa esa repartici</w:t>
+        <w:t>El factor de normalización 2/N se debe a que cuando tomamos N muestras reales de una señal senoidal pura de amplitud pico A, la energía de esa componente se reparte simétricamente entre el bin k y su "espejo conjugado" en N−k (una propiedad de la DFT de señales reales). De esta forma Multiplicar por 2/N compensa esa repartici</w:t>
       </w:r>
       <w:r>
         <w:rPr>
@@ -1986,10 +1923,7 @@
         <w:t>ó</w:t>
       </w:r>
       <w:r>
-        <w:t>n y recupera el pico real A de la senoidal</w:t>
-      </w:r>
-      <w:r>
-        <w:t>.</w:t>
+        <w:t>n y recupera el pico real A de la senoidal.</w:t>
       </w:r>
     </w:p>
     <w:p>
@@ -2026,37 +1960,17 @@
         <w:t xml:space="preserve">Es importante destacar que </w:t>
       </w:r>
       <w:r>
-        <w:t xml:space="preserve">la fórmula de normalización 2/N vale para </w:t>
-      </w:r>
-      <w:proofErr w:type="spellStart"/>
-      <w:r>
-        <w:t>bins</w:t>
-      </w:r>
-      <w:proofErr w:type="spellEnd"/>
-      <w:r>
-        <w:t xml:space="preserve"> k estrictamente entre 0 y N/2. En el caso límite </w:t>
-      </w:r>
-      <w:r>
-        <w:t xml:space="preserve">del </w:t>
-      </w:r>
-      <w:proofErr w:type="spellStart"/>
-      <w:r>
-        <w:t>armonico</w:t>
-      </w:r>
-      <w:proofErr w:type="spellEnd"/>
-      <w:r>
-        <w:t xml:space="preserve"> 50 con </w:t>
-      </w:r>
-      <w:r>
-        <w:t>k=N/2 (</w:t>
-      </w:r>
-      <w:proofErr w:type="spellStart"/>
-      <w:r>
-        <w:t>bin</w:t>
-      </w:r>
-      <w:proofErr w:type="spellEnd"/>
-      <w:r>
-        <w:t xml:space="preserve"> de Nyquist exacto</w:t>
+        <w:t xml:space="preserve">la fórmula de normalización 2/N vale para bins k estrictamente entre 0 y N/2. En el caso límite </w:t>
+      </w:r>
+      <w:r>
+        <w:t xml:space="preserve">del armonico 50 con </w:t>
+      </w:r>
+      <w:r>
+        <w:t xml:space="preserve">k=N/2 (bin de </w:t>
+      </w:r>
+      <w:r>
+        <w:lastRenderedPageBreak/>
+        <w:t>Nyquist exacto</w:t>
       </w:r>
       <w:r>
         <w:t xml:space="preserve">: </w:t>
@@ -2103,13 +2017,8 @@
       <w:r>
         <w:t xml:space="preserve">afectaría el </w:t>
       </w:r>
-      <w:proofErr w:type="gramStart"/>
-      <w:r>
-        <w:t>cálculo</w:t>
-      </w:r>
-      <w:proofErr w:type="gramEnd"/>
-      <w:r>
-        <w:t xml:space="preserve"> </w:t>
+      <w:r>
+        <w:t xml:space="preserve">cálculo </w:t>
       </w:r>
       <w:r>
         <w:t>pero se debe tener en cuenta si decidimos modificar la frecuencia de muestreo o la cantidad de muestras.</w:t>
@@ -2155,17 +2064,8 @@
           <w:b/>
           <w:bCs/>
         </w:rPr>
-        <w:t xml:space="preserve">no </w:t>
-      </w:r>
-      <w:proofErr w:type="spellStart"/>
-      <w:r>
-        <w:rPr>
-          <w:b/>
-          <w:bCs/>
-        </w:rPr>
-        <w:t>rms</w:t>
-      </w:r>
-      <w:proofErr w:type="spellEnd"/>
+        <w:t>no rms</w:t>
+      </w:r>
       <w:r>
         <w:rPr>
           <w:b/>
@@ -2313,12 +2213,178 @@
     </w:p>
     <w:p>
       <w:r>
-        <w:t>lo tengo que tener en cuenta después para no errarle al cálculo del THD</w:t>
-      </w:r>
-      <w:r>
-        <w:t>.</w:t>
-      </w:r>
-    </w:p>
+        <w:t>lo tengo que tener en cuenta después para no errarle al cálculo del THD.</w:t>
+      </w:r>
+    </w:p>
+    <w:p/>
+    <w:p>
+      <w:pPr>
+        <w:rPr>
+          <w:b/>
+          <w:bCs/>
+          <w:u w:val="single"/>
+        </w:rPr>
+      </w:pPr>
+      <w:r>
+        <w:rPr>
+          <w:b/>
+          <w:bCs/>
+          <w:u w:val="single"/>
+        </w:rPr>
+        <w:t>INTENSIDAD DE CORRIENTE</w:t>
+      </w:r>
+    </w:p>
+    <w:p>
+      <w:r>
+        <w:t>Se implementó la lógica de medición de corriente rms igual que la de tensión, por el momento no se agregó la lógica de dipswitchs de selección de R de burden ni la relación de los TI ya que dependen de la placa los puertos que se usen y no se puede validar.</w:t>
+      </w:r>
+    </w:p>
+    <w:p>
+      <w:pPr>
+        <w:rPr>
+          <w:b/>
+          <w:bCs/>
+          <w:u w:val="single"/>
+        </w:rPr>
+      </w:pPr>
+      <w:r>
+        <w:rPr>
+          <w:b/>
+          <w:bCs/>
+          <w:u w:val="single"/>
+        </w:rPr>
+        <w:t>POTENCIA ACTIVA/REACTIVA/APARENTE</w:t>
+      </w:r>
+    </w:p>
+    <w:p>
+      <w:r>
+        <w:t>Se implementó una lógica para calcular potencia activa, reactiva, aparente y factor de potencia a partir de los valores de tensión y corriente rms.</w:t>
+      </w:r>
+    </w:p>
+    <w:p/>
+    <w:p>
+      <w:r>
+        <w:rPr>
+          <w:b/>
+          <w:bCs/>
+          <w:u w:val="single"/>
+        </w:rPr>
+        <w:t>SAG/SWELL</w:t>
+      </w:r>
+      <w:r>
+        <w:t>:</w:t>
+      </w:r>
+      <w:r>
+        <w:t xml:space="preserve"> Se implementó lógica a partir de maquina de estados que fluctúa entre 3 estados EVENT_NONE, EVENT_SWELL, EVENT_SAG. Se probó con VRMS1 y funciona correctamente. Tener en cuenta que el nivel de tensión de referencia está hardcodeado.</w:t>
+      </w:r>
+      <w:r>
+        <w:t xml:space="preserve"> </w:t>
+      </w:r>
+    </w:p>
+    <w:p>
+      <w:pPr>
+        <w:jc w:val="center"/>
+      </w:pPr>
+      <w:r>
+        <w:drawing>
+          <wp:inline distT="0" distB="0" distL="0" distR="0" wp14:anchorId="76CD400C" wp14:editId="3B1EFC01">
+            <wp:extent cx="4102311" cy="1657435"/>
+            <wp:effectExtent l="0" t="0" r="0" b="0"/>
+            <wp:docPr id="3" name="Imagen 3"/>
+            <wp:cNvGraphicFramePr>
+              <a:graphicFrameLocks xmlns:a="http://schemas.openxmlformats.org/drawingml/2006/main" noChangeAspect="1"/>
+            </wp:cNvGraphicFramePr>
+            <a:graphic xmlns:a="http://schemas.openxmlformats.org/drawingml/2006/main">
+              <a:graphicData uri="http://schemas.openxmlformats.org/drawingml/2006/picture">
+                <pic:pic xmlns:pic="http://schemas.openxmlformats.org/drawingml/2006/picture">
+                  <pic:nvPicPr>
+                    <pic:cNvPr id="1" name=""/>
+                    <pic:cNvPicPr/>
+                  </pic:nvPicPr>
+                  <pic:blipFill>
+                    <a:blip r:embed="rId7"/>
+                    <a:stretch>
+                      <a:fillRect/>
+                    </a:stretch>
+                  </pic:blipFill>
+                  <pic:spPr>
+                    <a:xfrm>
+                      <a:off x="0" y="0"/>
+                      <a:ext cx="4102311" cy="1657435"/>
+                    </a:xfrm>
+                    <a:prstGeom prst="rect">
+                      <a:avLst/>
+                    </a:prstGeom>
+                  </pic:spPr>
+                </pic:pic>
+              </a:graphicData>
+            </a:graphic>
+          </wp:inline>
+        </w:drawing>
+      </w:r>
+    </w:p>
+    <w:p>
+      <w:r>
+        <w:rPr>
+          <w:b/>
+          <w:bCs/>
+          <w:u w:val="single"/>
+        </w:rPr>
+        <w:lastRenderedPageBreak/>
+        <w:t xml:space="preserve">FRECUENCIA: </w:t>
+      </w:r>
+      <w:r>
+        <w:t>Se implementó lógica para calculo máximo y mínimo y acotar el valor midiendo los cruces por cero pero tiene mucho ruido.</w:t>
+      </w:r>
+    </w:p>
+    <w:p/>
+    <w:p>
+      <w:r>
+        <w:rPr>
+          <w:b/>
+          <w:bCs/>
+          <w:u w:val="single"/>
+        </w:rPr>
+        <w:t xml:space="preserve">HISTERESIS: </w:t>
+      </w:r>
+      <w:r>
+        <w:t xml:space="preserve">Se implementaron ajustes por histéresis </w:t>
+      </w:r>
+      <w:r>
+        <w:t>para evitar detecciones falsas por oscilación en el umbral.</w:t>
+      </w:r>
+    </w:p>
+    <w:p/>
+    <w:p>
+      <w:pPr>
+        <w:rPr>
+          <w:b/>
+          <w:bCs/>
+          <w:color w:val="FF0000"/>
+          <w:highlight w:val="yellow"/>
+          <w:u w:val="single"/>
+        </w:rPr>
+      </w:pPr>
+      <w:r>
+        <w:rPr>
+          <w:b/>
+          <w:bCs/>
+          <w:color w:val="FF0000"/>
+          <w:highlight w:val="yellow"/>
+          <w:u w:val="single"/>
+        </w:rPr>
+        <w:t>IMPORTANTE</w:t>
+      </w:r>
+    </w:p>
+    <w:p>
+      <w:r>
+        <w:rPr>
+          <w:highlight w:val="yellow"/>
+        </w:rPr>
+        <w:t>En esta instancia resultó muy difícil efectuar las mediciones de forma certera ya que variaban demasiado debido al ruido de alta frecuencia causado por las fuentes.</w:t>
+      </w:r>
+    </w:p>
+    <w:p/>
     <w:sectPr>
       <w:pgSz w:w="11906" w:h="16838"/>
       <w:pgMar w:top="1417" w:right="1701" w:bottom="1417" w:left="1701" w:header="708" w:footer="708" w:gutter="0"/>
@@ -3495,6 +3561,7 @@
   <w:style w:type="character" w:default="1" w:styleId="Fuentedeprrafopredeter">
     <w:name w:val="Default Paragraph Font"/>
     <w:uiPriority w:val="1"/>
+    <w:semiHidden/>
     <w:unhideWhenUsed/>
   </w:style>
   <w:style w:type="table" w:default="1" w:styleId="Tablanormal">

</xml_diff>